<commit_message>
Remove budget details from public strategy; replace with a Budget placeholder and regenerate DOCX/PDF\n\nCo-authored-by: Copilot <223556219+Copilot@users.noreply.github.com>
</commit_message>
<xml_diff>
--- a/OWR_CONS_TEC_STRATEGY_V1_EXTENDED.docx
+++ b/OWR_CONS_TEC_STRATEGY_V1_EXTENDED.docx
@@ -1828,67 +1828,12 @@
         <w:pStyle w:val="Heading2"/>
       </w:pPr>
       <w:r>
-        <w:t>Section: High-Level Budget Estimate (2026–2028)</w:t>
-      </w:r>
-    </w:p>
-    <w:p>
-      <w:r>
-        <w:t>Assumptions</w:t>
-      </w:r>
-    </w:p>
-    <w:p>
-      <w:r>
-        <w:t>- Costs are presented as order-of-magnitude estimates; local procurement and freight may vary.</w:t>
-      </w:r>
-    </w:p>
-    <w:p>
-      <w:r>
-        <w:t>Cost categories (USD, rounded)</w:t>
-      </w:r>
-    </w:p>
-    <w:p>
-      <w:r>
-        <w:t>- Hardware &amp; sensors (camera traps, drones, collars, acoustic units): $350,000</w:t>
-      </w:r>
-    </w:p>
-    <w:p>
-      <w:r>
-        <w:t>- Field devices &amp; connectivity (rugged tablets, satellite comms, Garmin): $120,000</w:t>
-      </w:r>
-    </w:p>
-    <w:p>
-      <w:r>
-        <w:t>- Middleware &amp; cloud processing (Wildlife Insights credits, GFW alerts, hosting): $60,000/year</w:t>
-      </w:r>
-    </w:p>
-    <w:p>
-      <w:r>
-        <w:t>- Training &amp; capacity building (workshops, per diems, materials): $80,000</w:t>
-      </w:r>
-    </w:p>
-    <w:p>
-      <w:r>
-        <w:t>- Operations &amp; maintenance (spares, batteries, transport): $70,000/year</w:t>
-      </w:r>
-    </w:p>
-    <w:p>
-      <w:r>
-        <w:t>- Personnel (PMU, data manager, technicians): $180,000/year</w:t>
-      </w:r>
-    </w:p>
-    <w:p>
-      <w:r>
-        <w:t>- Contingency &amp; security premiums: $60,000</w:t>
-      </w:r>
-    </w:p>
-    <w:p>
-      <w:r>
-        <w:t>Total estimated first two-year cost (approx): $1,500,000</w:t>
-      </w:r>
-    </w:p>
-    <w:p>
-      <w:r>
-        <w:t>Notes: refine with localized vendor quotes and donor agreement. Include lifecycle replacement costs in five-year planning.</w:t>
+        <w:t>Budget</w:t>
+      </w:r>
+    </w:p>
+    <w:p>
+      <w:r>
+        <w:t>Budget information has been removed from this public strategy document. Detailed budgetary estimates and procurement plans are maintained by the PMU and available on request to authorized stakeholders.</w:t>
       </w:r>
     </w:p>
     <w:p>

</xml_diff>